<commit_message>
Lab Sheet 01 Complete
</commit_message>
<xml_diff>
--- a/01.LB01/LB01.docx
+++ b/01.LB01/LB01.docx
@@ -1970,25 +1970,7 @@
           <w:b/>
           <w:bCs/>
         </w:rPr>
-        <w:t xml:space="preserve">Download the appropriate file (.pdf </w:t>
-      </w:r>
-      <w:proofErr w:type="gramStart"/>
-      <w:r>
-        <w:rPr>
-          <w:rFonts w:ascii="Times New Roman" w:hAnsi="Times New Roman" w:cs="Times New Roman"/>
-          <w:b/>
-          <w:bCs/>
-        </w:rPr>
-        <w:t>or .</w:t>
-      </w:r>
-      <w:proofErr w:type="gramEnd"/>
-      <w:r>
-        <w:rPr>
-          <w:rFonts w:ascii="Times New Roman" w:hAnsi="Times New Roman" w:cs="Times New Roman"/>
-          <w:b/>
-          <w:bCs/>
-        </w:rPr>
-        <w:t xml:space="preserve">tar.gz) of the BOUML reference (user) manual in    </w:t>
+        <w:t xml:space="preserve">Download the appropriate file (.pdf or .tar.gz) of the BOUML reference (user) manual in    </w:t>
       </w:r>
       <w:hyperlink r:id="rId20" w:history="1">
         <w:r>
@@ -2051,17 +2033,7 @@
           <w:bCs/>
           <w:color w:val="auto"/>
         </w:rPr>
-        <w:t xml:space="preserve">Use Case </w:t>
-      </w:r>
-      <w:proofErr w:type="gramStart"/>
-      <w:r>
-        <w:rPr>
-          <w:rFonts w:ascii="Times New Roman" w:hAnsi="Times New Roman" w:cs="Times New Roman"/>
-          <w:b/>
-          <w:bCs/>
-          <w:color w:val="auto"/>
-        </w:rPr>
-        <w:t xml:space="preserve">Diagrams  </w:t>
+        <w:t xml:space="preserve">Use Case Diagrams  </w:t>
       </w:r>
       <w:r>
         <w:rPr>
@@ -2073,7 +2045,6 @@
         </w:rPr>
         <w:t>•</w:t>
       </w:r>
-      <w:proofErr w:type="gramEnd"/>
       <w:r>
         <w:rPr>
           <w:rFonts w:ascii="Times New Roman" w:eastAsia="Arial" w:hAnsi="Times New Roman" w:cs="Times New Roman"/>
@@ -2563,27 +2534,7 @@
           <w:bCs/>
           <w:color w:val="auto"/>
         </w:rPr>
-        <w:t xml:space="preserve">Relationships in the </w:t>
-      </w:r>
-      <w:proofErr w:type="spellStart"/>
-      <w:r>
-        <w:rPr>
-          <w:rFonts w:ascii="Times New Roman" w:hAnsi="Times New Roman" w:cs="Times New Roman"/>
-          <w:b/>
-          <w:bCs/>
-          <w:color w:val="auto"/>
-        </w:rPr>
-        <w:t>UseCase</w:t>
-      </w:r>
-      <w:proofErr w:type="spellEnd"/>
-      <w:r>
-        <w:rPr>
-          <w:rFonts w:ascii="Times New Roman" w:hAnsi="Times New Roman" w:cs="Times New Roman"/>
-          <w:b/>
-          <w:bCs/>
-          <w:color w:val="auto"/>
-        </w:rPr>
-        <w:t xml:space="preserve"> Diagram </w:t>
+        <w:t xml:space="preserve">Relationships in the UseCase Diagram </w:t>
       </w:r>
     </w:p>
     <w:p>
@@ -3176,6 +3127,60 @@
       </w:pPr>
       <w:r>
         <w:rPr>
+          <w:noProof/>
+        </w:rPr>
+        <w:drawing>
+          <wp:anchor distT="0" distB="0" distL="114300" distR="114300" simplePos="0" relativeHeight="251662336" behindDoc="0" locked="0" layoutInCell="1" allowOverlap="1" wp14:anchorId="172B4642" wp14:editId="7CACF1F4">
+            <wp:simplePos x="0" y="0"/>
+            <wp:positionH relativeFrom="column">
+              <wp:posOffset>-427512</wp:posOffset>
+            </wp:positionH>
+            <wp:positionV relativeFrom="paragraph">
+              <wp:posOffset>174625</wp:posOffset>
+            </wp:positionV>
+            <wp:extent cx="6833235" cy="3716655"/>
+            <wp:effectExtent l="0" t="0" r="5715" b="0"/>
+            <wp:wrapTopAndBottom/>
+            <wp:docPr id="31" name="Picture 31"/>
+            <wp:cNvGraphicFramePr>
+              <a:graphicFrameLocks xmlns:a="http://schemas.openxmlformats.org/drawingml/2006/main" noChangeAspect="1"/>
+            </wp:cNvGraphicFramePr>
+            <a:graphic xmlns:a="http://schemas.openxmlformats.org/drawingml/2006/main">
+              <a:graphicData uri="http://schemas.openxmlformats.org/drawingml/2006/picture">
+                <pic:pic xmlns:pic="http://schemas.openxmlformats.org/drawingml/2006/picture">
+                  <pic:nvPicPr>
+                    <pic:cNvPr id="1" name=""/>
+                    <pic:cNvPicPr/>
+                  </pic:nvPicPr>
+                  <pic:blipFill>
+                    <a:blip r:embed="rId28">
+                      <a:extLst>
+                        <a:ext uri="{28A0092B-C50C-407E-A947-70E740481C1C}">
+                          <a14:useLocalDpi xmlns:a14="http://schemas.microsoft.com/office/drawing/2010/main" val="0"/>
+                        </a:ext>
+                      </a:extLst>
+                    </a:blip>
+                    <a:stretch>
+                      <a:fillRect/>
+                    </a:stretch>
+                  </pic:blipFill>
+                  <pic:spPr>
+                    <a:xfrm>
+                      <a:off x="0" y="0"/>
+                      <a:ext cx="6833235" cy="3716655"/>
+                    </a:xfrm>
+                    <a:prstGeom prst="rect">
+                      <a:avLst/>
+                    </a:prstGeom>
+                  </pic:spPr>
+                </pic:pic>
+              </a:graphicData>
+            </a:graphic>
+          </wp:anchor>
+        </w:drawing>
+      </w:r>
+      <w:r>
+        <w:rPr>
           <w:rFonts w:ascii="Times New Roman" w:hAnsi="Times New Roman" w:cs="Times New Roman"/>
           <w:b/>
           <w:bCs/>
@@ -3191,6 +3196,79 @@
           <w:bCs/>
         </w:rPr>
       </w:pPr>
+    </w:p>
+    <w:p>
+      <w:pPr>
+        <w:rPr>
+          <w:rFonts w:ascii="Times New Roman" w:hAnsi="Times New Roman" w:cs="Times New Roman"/>
+          <w:b/>
+          <w:bCs/>
+        </w:rPr>
+      </w:pPr>
+    </w:p>
+    <w:p>
+      <w:pPr>
+        <w:rPr>
+          <w:rFonts w:ascii="Times New Roman" w:hAnsi="Times New Roman" w:cs="Times New Roman"/>
+          <w:b/>
+          <w:bCs/>
+        </w:rPr>
+      </w:pPr>
+      <w:r>
+        <w:rPr>
+          <w:noProof/>
+        </w:rPr>
+        <w:lastRenderedPageBreak/>
+        <w:drawing>
+          <wp:anchor distT="0" distB="0" distL="114300" distR="114300" simplePos="0" relativeHeight="251663360" behindDoc="0" locked="0" layoutInCell="1" allowOverlap="1" wp14:anchorId="17280B66" wp14:editId="1E5E4B98">
+            <wp:simplePos x="0" y="0"/>
+            <wp:positionH relativeFrom="column">
+              <wp:posOffset>-332756</wp:posOffset>
+            </wp:positionH>
+            <wp:positionV relativeFrom="paragraph">
+              <wp:posOffset>0</wp:posOffset>
+            </wp:positionV>
+            <wp:extent cx="6949822" cy="4528522"/>
+            <wp:effectExtent l="0" t="0" r="3810" b="5715"/>
+            <wp:wrapTopAndBottom/>
+            <wp:docPr id="32" name="Picture 32"/>
+            <wp:cNvGraphicFramePr>
+              <a:graphicFrameLocks xmlns:a="http://schemas.openxmlformats.org/drawingml/2006/main" noChangeAspect="1"/>
+            </wp:cNvGraphicFramePr>
+            <a:graphic xmlns:a="http://schemas.openxmlformats.org/drawingml/2006/main">
+              <a:graphicData uri="http://schemas.openxmlformats.org/drawingml/2006/picture">
+                <pic:pic xmlns:pic="http://schemas.openxmlformats.org/drawingml/2006/picture">
+                  <pic:nvPicPr>
+                    <pic:cNvPr id="1" name=""/>
+                    <pic:cNvPicPr/>
+                  </pic:nvPicPr>
+                  <pic:blipFill>
+                    <a:blip r:embed="rId29">
+                      <a:extLst>
+                        <a:ext uri="{28A0092B-C50C-407E-A947-70E740481C1C}">
+                          <a14:useLocalDpi xmlns:a14="http://schemas.microsoft.com/office/drawing/2010/main" val="0"/>
+                        </a:ext>
+                      </a:extLst>
+                    </a:blip>
+                    <a:stretch>
+                      <a:fillRect/>
+                    </a:stretch>
+                  </pic:blipFill>
+                  <pic:spPr>
+                    <a:xfrm>
+                      <a:off x="0" y="0"/>
+                      <a:ext cx="6949822" cy="4528522"/>
+                    </a:xfrm>
+                    <a:prstGeom prst="rect">
+                      <a:avLst/>
+                    </a:prstGeom>
+                  </pic:spPr>
+                </pic:pic>
+              </a:graphicData>
+            </a:graphic>
+          </wp:anchor>
+        </w:drawing>
+      </w:r>
     </w:p>
     <w:sectPr>
       <w:pgSz w:w="12240" w:h="15840"/>

</xml_diff>